<commit_message>
Roteiro Rick: ajustes na parte 5
Co-Authored-By: Claude Opus 5.5 <noreply@anthropic.com>
Claude-Session: https://claude.ai/code/session_01MJjUEEZrxQDEUifKK2vj9g
</commit_message>
<xml_diff>
--- a/roteiros/rick/Rick_Parte5.docx
+++ b/roteiros/rick/Rick_Parte5.docx
@@ -31,7 +31,7 @@
         <w:rPr>
           <w:color w:val="000000"/>
         </w:rPr>
-        <w:t>Naquela noite, uma família da cidade comemorava os quinze anos da filha.</w:t>
+        <w:t>Naquele sábado, uma família da cidade comemorava os quinze anos da filha.</w:t>
       </w:r>
     </w:p>
     <w:p>
@@ -55,7 +55,7 @@
         <w:rPr>
           <w:color w:val="000000"/>
         </w:rPr>
-        <w:t>A aniversariante sabia qual música ia tocar. Esperava ouvir "Filha" saindo das caixas de som, como em tantas festas que ela mesma já tinha visto. A gravação de sempre, com a voz de Rick que o Brasil conhece há mais de vinte e cinco anos.</w:t>
+        <w:t>A aniversariante já imaginava a homenagem. Esperava que o pai dançasse com ela ao som de "Filha", como em tantas festas que ela mesma já tinha visto. A gravação de sempre, com a voz de Rick que o Brasil conhece há mais de vinte e cinco anos.</w:t>
       </w:r>
     </w:p>
     <w:p>
@@ -143,7 +143,7 @@
         <w:rPr>
           <w:color w:val="C00000"/>
         </w:rPr>
-        <w:t>E agora chegou a hora. Lembra do áudio que eu te falei no começo? Aquele que Rick gravou na manhã de segunda-feira, já de partida? Vou te mostrar agora cada palavra dele. E presta atenção em dois detalhes. Porque um deles se conecta ao celular que guiou as buscas. E o outro se conecta ao acidente de dois mil e vinte e quatro.</w:t>
+        <w:t>E agora chegou a hora. Lembra do áudio que eu te falei no começo, aquele que Rick gravou na segunda-feira, já de partida? Vou te mostrar agora cada palavra dele. E presta atenção em dois detalhes. Porque um deles se conecta ao celular que guiou as buscas. E o outro se conecta ao acidente de dois mil e vinte e quatro.</w:t>
       </w:r>
     </w:p>
     <w:p>
@@ -335,7 +335,7 @@
         <w:rPr>
           <w:color w:val="000000"/>
         </w:rPr>
-        <w:t>Em Rancho Queimado, o funcionário esperava num lugar com sinal, como Rick tinha pedido. E via o tempo piorar. Naquela tarde, a chuva forte e as tempestades tomaram conta da serra.</w:t>
+        <w:t>Em Rancho Queimado, o funcionário que esperava por Rick via o tempo piorar. Naquela tarde, a chuva forte e as tempestades tomaram conta da serra.</w:t>
       </w:r>
     </w:p>
     <w:p>
@@ -351,7 +351,7 @@
         <w:rPr>
           <w:color w:val="000000"/>
         </w:rPr>
-        <w:t>Nem a São Joaquim, onde Rick ia almoçar na casa de campo. Nem a Rancho Queimado, onde alguém esperava com o celular na mão.</w:t>
+        <w:t>Nem a São Joaquim, onde Rick ia almoçar na casa de campo. Nem a Rancho Queimado, onde alguém esperava por ele.</w:t>
       </w:r>
     </w:p>
     <w:p>

</xml_diff>